<commit_message>
docs(patent): apply v3 claim fixes to DOCX builder and assembled MD — rebuild DOCX
Claims 1/3/21/23/24 updated in build_patent_docx.py CLAIMS array and assembled MD:
- Claim 1 whereby: B^(k*d) bounded-exponential language (was generic nonlinear)
- Claim 3: adds species (iii) pi^(phi*d) named embodiment
- Claim 21: N-predicate >=3 (semantic/geometric/crypto) replacing 5-predicate conjunction
- Claim 23: REROUTE substitution-without-deny replacing EMA tau swarm trust
- Claim 24: null-space anomaly detection replacing Hopfield energy function

SCBE_NONPROVISIONAL_SPEC_v1.docx rebuilt; blocker spec_docx_whereby_updated resolved

Co-Authored-By: Claude Sonnet 4.6 <noreply@anthropic.com>
</commit_message>
<xml_diff>
--- a/docs/legal/SCBE_NONPROVISIONAL_SPEC_v1.docx
+++ b/docs/legal/SCBE_NONPROVISIONAL_SPEC_v1.docx
@@ -179,7 +179,7 @@
           <w:b w:val="0"/>
           <w:sz w:val="24"/>
         </w:rPr>
-        <w:t>There exists a need in the art for a security framework that: (a) enforces access control through mathematical invariants that cannot be circumvented by adversarial optimization; (b) scales the cost of adversarial behavior superexponentially with the degree of deviation from trusted operation; (c) derives cryptographic keys from structured semantic inputs that constrain the available derivation paths; (d) binds authorization to geometric position, path history, and domain membership simultaneously; and (e) provides post-quantum security through dual-lattice consensus with temporal synchronization.</w:t>
+        <w:t>There exists a need in the art for a security framework that: (a) enforces access control through measured geometric state rather than pattern matching alone; (b) scales the cost or risk assigned to adversarial behavior as a nonlinear function of the degree of deviation from trusted operation; (c) derives cryptographic keys from structured semantic inputs that constrain the available derivation paths; (d) binds authorization to geometric position, path history, and domain membership simultaneously; and (e) provides post-quantum security through dual-lattice consensus with temporal synchronization.</w:t>
       </w:r>
     </w:p>
     <w:p>
@@ -206,7 +206,7 @@
           <w:b w:val="0"/>
           <w:sz w:val="24"/>
         </w:rPr>
-        <w:t>It is a primary object of the present invention to provide an access control system wherein the verification cost imposed on a requesting entity is a superexponential function of its hyperbolic distance from a trusted operational center, thereby creating a geometric enforcement barrier that renders adversarial operation computationally infeasible as the entity approaches the manifold boundary.</w:t>
+        <w:t>It is a primary object of the present invention to provide an access control system wherein the verification cost or risk imposed on a requesting entity is a nonlinear increasing function of its measured drift from a trusted operational center, thereby creating a geometric enforcement barrier that makes adversarial operation increasingly costly as the entity moves away from trusted behavior.</w:t>
       </w:r>
     </w:p>
     <w:p>
@@ -234,7 +234,7 @@
           <w:b w:val="0"/>
           <w:sz w:val="24"/>
         </w:rPr>
-        <w:t>It is a further object to provide a cryptographic identity container that implements deferred authorization through a conjunction of five predicates -- tongue membership, geometric ring position, monotone descent path history, quorum approval, and AEAD cryptographic verification -- wherein failure of any predicate produces cryptographically random output of identical length to a successful decryption, rendering the failure mode indistinguishable from success to an external observer.</w:t>
+        <w:t>It is a further object to provide a cryptographic identity container that implements deferred authorization through a plurality of predicates -- including semantic, geometric, path-history, quorum, or AEAD cryptographic verification predicates -- wherein failure of any predicate may produce noise or pseudorandom-looking output of identical length to a successful decryption.</w:t>
       </w:r>
     </w:p>
     <w:p>
@@ -360,7 +360,7 @@
           <w:b w:val="0"/>
           <w:sz w:val="24"/>
         </w:rPr>
-        <w:t>Preferred embodiments include: session-adaptive centroid accumulation; a multi-layer pre-filter stack ordered cheapest-reject-first; a fail-to-noise response returning deterministic pseudorandom output indistinguishable from valid output upon denial; durable state persistence and rollback across process restarts; quarantine non-error containment that restricts tool access and execution resources without terminating the session; post-quantum decision receipts signed under ML-DSA-65 and encapsulated under ML-KEM-768; six-axis semantic weighting using golden-ratio-scaled tongue weights; and physics-based task coordination for multi-agent governance.</w:t>
+        <w:t>Preferred embodiments include: session-adaptive centroid accumulation; a multi-layer pre-filter stack ordered cheapest-reject-first; a fail-to-noise response returning deterministic pseudorandom-looking audit output upon denial; durable state persistence and rollback across process restarts; quarantine non-error containment that restricts tool access and execution resources without terminating the session; post-quantum decision receipts signed under ML-DSA-65 and encapsulated under ML-KEM-768; six-axis semantic weighting using golden-ratio-scaled tongue weights; and physics-based task coordination for multi-agent governance.</w:t>
       </w:r>
     </w:p>
     <w:p>
@@ -418,7 +418,7 @@
           <w:b w:val="0"/>
           <w:sz w:val="24"/>
         </w:rPr>
-        <w:t>Harmonic wall cost function H(d,R) = R^(d^2) plotted on a log scale as verification cost versus hyperbolic distance d for base R = e, showing superexponential growth with the critical 128-bit security threshold at d_crit approximately equals 9.42.</w:t>
+        <w:t>Alternative harmonic cost functions plotted against measured drift, including H(d,R) = R^(d^2), a bounded reciprocal score 1/(1+d+2*pd), and a clamped RuntimeGate cost pi^(phi*min(d*,d_max)).</w:t>
       </w:r>
     </w:p>
     <w:p>
@@ -484,7 +484,7 @@
           <w:b w:val="0"/>
           <w:sz w:val="24"/>
         </w:rPr>
-        <w:t>Sacred Egg five-predicate deferred authorization flowchart showing the conjunction P_tongue AND P_geo AND P_path AND P_quorum AND P_crypto, wherein failure of any predicate branches to a fail-to-noise output indistinguishable from a successful decryption output.</w:t>
+        <w:t>Sacred Egg five-predicate deferred authorization flowchart showing the conjunction P_tongue AND P_geo AND P_path AND P_quorum AND P_crypto, wherein failure of any predicate branches to a fail-to-noise or pseudorandom-looking audit output.</w:t>
       </w:r>
     </w:p>
     <w:p>
@@ -753,7 +753,7 @@
           <w:b w:val="0"/>
           <w:sz w:val="24"/>
         </w:rPr>
-        <w:t>"Fail-to-Noise": The security property that any authorization failure produces output that is computationally indistinguishable from a successful authorization output. Specifically, upon failure of any predicate during Sacred Egg hatching, the system generates cryptographically random bytes of identical length to the true plaintext, using crypto.getRandomValues() or equivalent CSPRNG.</w:t>
+        <w:t>"Fail-to-Noise": A failure-handling property in which an authorization failure returns a noise or pseudorandom-looking output rather than a structured error message. In some embodiments the noise is deterministic and audit-reproducible from a content hash; in other embodiments the noise is generated by a keyed or cryptographic random generator.</w:t>
       </w:r>
     </w:p>
     <w:p>
@@ -767,7 +767,7 @@
           <w:b w:val="0"/>
           <w:sz w:val="24"/>
         </w:rPr>
-        <w:t>"Harmonic Wall" or "Harmonic Scaling": The superexponential cost function H(d, R) = R^(d^2) where d is the hyperbolic distance from a trusted center and R &gt; 1 is the base parameter. This function creates a "vertical wall" effect: the cost is modest for small d (H(1) = 2.72 for R = e) but becomes computationally infeasible for large d (H(5) = 7.2 x 10^10 for R = e), with the critical 128-bit security threshold at d_crit = sqrt(128 * ln(2)) approximately equals 9.42.</w:t>
+        <w:t>"Harmonic Wall" or "Harmonic Scaling": A nonlinear cost or score function that maps measured drift to governance risk or safety score. Embodiments include H(d, R) = R^(d^2) where R &gt; 1, a bounded reciprocal safety score H = 1/(1+d+2pd), and a clamped RuntimeGate cost C = pi^(phimin(d*, d_max)). The selected embodiment depends on runtime stability, auditability, and numerical constraints.</w:t>
       </w:r>
     </w:p>
     <w:p>
@@ -1265,7 +1265,7 @@
           <w:b w:val="0"/>
           <w:sz w:val="24"/>
         </w:rPr>
-        <w:t>The clamping is essential for computational stability but does not affect the security properties: the Harmonic Wall (Layer 12) already imposes superexponential cost for points approaching the boundary.</w:t>
+        <w:t>The clamping is essential for computational stability. Layer 12 then maps the resulting measured drift to a governance cost or safety score using one of the disclosed nonlinear cost embodiments.</w:t>
       </w:r>
     </w:p>
     <w:p>
@@ -1979,7 +1979,7 @@
           <w:b/>
           <w:sz w:val="24"/>
         </w:rPr>
-        <w:t>3.12 Layer 12: Harmonic Scaling -- THE VERTICAL WALL (Axiom A12)</w:t>
+        <w:t>3.12 Layer 12: Harmonic Scaling -- NONLINEAR GOVERNANCE COST (Axiom A12)</w:t>
       </w:r>
     </w:p>
     <w:p>
@@ -1993,7 +1993,7 @@
           <w:b w:val="0"/>
           <w:sz w:val="24"/>
         </w:rPr>
-        <w:t>Layer 12 applies the Harmonic Wall function to convert hyperbolic distance into verification cost:</w:t>
+        <w:t>Layer 12 applies a harmonic scaling function to convert measured drift or hyperbolic distance into verification cost or safety score. Several embodiments are supported:</w:t>
       </w:r>
     </w:p>
     <w:p>
@@ -2007,7 +2007,7 @@
           <w:b w:val="0"/>
           <w:sz w:val="24"/>
         </w:rPr>
-        <w:t>This is the central enforcement mechanism of the invention. The superexponential growth of R^(d^2) as a function of d creates a "vertical wall" effect:</w:t>
+        <w:t>The first embodiment grows superlinearly in the exponent as a function of d and creates a "vertical wall" effect:</w:t>
       </w:r>
     </w:p>
     <w:p>
@@ -2101,7 +2101,7 @@
           <w:b w:val="0"/>
           <w:sz w:val="24"/>
         </w:rPr>
-        <w:t>This bounded form maps the superexponential wall into a reciprocal form suitable for IEEE 754 floating-point arithmetic while preserving the qualitative property that large distances produce large risk amplification.</w:t>
+        <w:t>The bounded reciprocal form maps larger distances to lower safety scores in a manner suitable for IEEE 754 floating-point arithmetic. The clamped RuntimeGate form uses a bounded exponent to avoid overflow while preserving monotonic cost growth up to a configured cap.</w:t>
       </w:r>
     </w:p>
     <w:p>
@@ -3212,7 +3212,7 @@
           <w:b w:val="0"/>
           <w:sz w:val="24"/>
         </w:rPr>
-        <w:t>When any predicate fails, the Sacred Egg produces cryptographically random output of the same length as the true plaintext:</w:t>
+        <w:t>When any predicate fails, the Sacred Egg may produce random, keyed, or deterministic pseudorandom-looking output of the same length as the true plaintext:</w:t>
       </w:r>
     </w:p>
     <w:p>
@@ -3246,7 +3246,7 @@
           <w:b w:val="0"/>
           <w:sz w:val="24"/>
         </w:rPr>
-        <w:t>The fail-to-noise property is essential because it eliminates the information-theoretic side channel that traditional error messages create. An attacker who can distinguish "wrong password" from "wrong username" gains information that reduces the search space; fail-to-noise provides zero bits of distinguishing information.</w:t>
+        <w:t>The fail-to-noise property reduces the side channel that traditional error messages create. An attacker who can distinguish "wrong password" from "wrong username" gains information that reduces the search space; fail-to-noise avoids returning such structured failure categories.</w:t>
       </w:r>
     </w:p>
     <w:p>
@@ -5022,7 +5022,7 @@
         <w:br/>
         <w:t>| A11 | Triadic distance: d_tri = sqrt(lambda_1d_1^2 + lambda_2d_2^2 + lambda_3*d_G^2) | L11 |</w:t>
         <w:br/>
-        <w:t>| A12 | Harmonic scaling: H(d, R) = R^(d^2) | L12 |</w:t>
+        <w:t>| A12 | Harmonic scaling: nonlinear drift-to-cost or drift-to-score mapping | L12 |</w:t>
       </w:r>
     </w:p>
     <w:p>
@@ -5335,7 +5335,7 @@
           <w:b w:val="0"/>
           <w:sz w:val="24"/>
         </w:rPr>
-        <w:t>whereby the governance cost increases superexponentially as the embedded point approaches a boundary of the open unit ball.</w:t>
+        <w:t>whereby the governance cost follows a function of the form B^(k*d), where B is a base greater than one, k is a positive scaling constant, and d is a distance measure computed from the hyperbolic space, such that the governance cost increases monotonically as the embedded point deviates from the session centroid.</w:t>
       </w:r>
     </w:p>
     <w:p>
@@ -5363,7 +5363,7 @@
           <w:b w:val="0"/>
           <w:sz w:val="24"/>
         </w:rPr>
-        <w:t>3. The method of claim 1, wherein the nonlinear cost function comprises one of: (i) a function of the form H(d, R) = R^(d^2), where d is a distance measure and R is a base greater than one; or (ii) a bounded safety-score function of the form H = 1 / (1 + d + 2*pd), where pd is a phase-deviation term.</w:t>
+        <w:t>3. The method of claim 1, wherein the nonlinear cost function comprises one of: (i) a function of the form H(d, R) = R^(d^2), where d is a distance measure and R is a base greater than one; (ii) a bounded safety-score function of the form H = 1 / (1 + d + 2*pd), where pd is a phase-deviation term; or (iii) a function of the form pi^(phi*d), where pi is the mathematical constant pi and phi is the golden ratio.</w:t>
       </w:r>
     </w:p>
     <w:p>
@@ -5419,7 +5419,7 @@
           <w:b w:val="0"/>
           <w:sz w:val="24"/>
         </w:rPr>
-        <w:t>7. The method of claim 1, further comprising, responsive to a deny decision, generating a deterministic pseudorandom noise output by computing a seed as a cryptographic hash of a fixed prefix concatenated with a content hash of the denied request, iteratively re-hashing the seed until a target length is reached, and returning the noise output in place of an error response, such that the noise output is indistinguishable from a valid output to an observer not holding the governance keys, is identical for identical denied requests, and is reproducible by an auditor from the content hash.</w:t>
+        <w:t>7. The method of claim 1, further comprising, responsive to a deny decision, generating a deterministic pseudorandom-looking noise output by computing a seed as a cryptographic hash of a fixed prefix concatenated with a content hash of the denied request, iteratively re-hashing the seed until a target length is reached, and returning the noise output in place of an error response, such that the noise output is identical for identical denied requests and is reproducible by an auditor from the content hash.</w:t>
       </w:r>
     </w:p>
     <w:p>
@@ -5825,7 +5825,7 @@
           <w:b w:val="0"/>
           <w:sz w:val="24"/>
         </w:rPr>
-        <w:t>21. The method of claim 1, further comprising generating a cryptographic authorization container that is unlocked only when all of N predetermined predicates are satisfied, the predicates comprising at least: a semantic predicate; a geometric predicate measuring distance from a known safe region; an execution-path predicate verifying that the container was reached via an authorized call chain; a quorum predicate requiring a threshold number of approving agents; and a cryptographic predicate verifying a post-quantum signature; wherein failure of any predicate returns a noise output indistinguishable from a successfully-unlocked container.</w:t>
+        <w:t>21. The method of claim 1, further comprising generating a cryptographic authorization container that is unlocked only when N predetermined predicates are satisfied, where N is at least three, the predicates including at least: a semantic predicate evaluating whether the context representation of the proposed action satisfies an authorized semantic profile; a geometric predicate measuring whether the embedded point lies within a predetermined hyperbolic distance from the session centroid; and a cryptographic predicate verifying a post-quantum signature; wherein failure of any predicate causes the container to return a noise output generated by the fail-to-noise function of claim 7, such that both a successful unlock and any predicate failure produce outputs that are indistinguishable to an observer not holding the authorization keys.</w:t>
       </w:r>
     </w:p>
     <w:p>
@@ -5853,7 +5853,7 @@
           <w:b w:val="0"/>
           <w:sz w:val="24"/>
         </w:rPr>
-        <w:t>23. The system of claim 9, wherein the system maintains a swarm trust score for each participating governance agent, updates the trust score as tau_new = alpha * tau_old + (1 - alpha) * v, where v is a validity factor for a most-recent contribution and alpha is a smoothing constant, and automatically self-excludes from the governance decision any agent whose trust score falls below a participation threshold, thereby producing a Byzantine-fault-tolerant swarm consensus without a central coordinator.</w:t>
+        <w:t>23. The method of claim 1, further comprising: prior to emitting the governance decision, determining whether the computational action matches a predetermined reroute rule associated with a class of actions; and, when a match is found, substituting a replacement action for the proposed computational action and emitting an allow decision for the replacement action, such that high-risk classes of actions are redirected to lower-risk alternatives without exposing a denial response to the requesting entity.</w:t>
       </w:r>
     </w:p>
     <w:p>
@@ -5867,7 +5867,7 @@
           <w:b w:val="0"/>
           <w:sz w:val="24"/>
         </w:rPr>
-        <w:t>24. The method of claim 1, further comprising applying a Hopfield energy function E(c) = -1/2 * (c')^T * W * c' + theta^T * c' to the context representation c, wherein W encodes patterns of known legitimate operations learned offline; classifying the action as novel-intent when E(c) is above a threshold relative to trained patterns; and incorporating the novel-intent indicator into the composite risk value.</w:t>
+        <w:t>24. The method of claim 1, further comprising computing a null-space anomaly score by determining whether per-axis deviations of the context representation from the session centroid each fall below a predetermined threshold; incrementing the null-space anomaly score when all per-axis deviations are below the threshold; and incorporating the null-space anomaly score into the composite risk value; wherein a null-space anomaly score above a predetermined level is treated as a governance signal indicating an action that is deliberately mimicking baseline behavior to evade the governance cost.</w:t>
       </w:r>
     </w:p>
     <w:p>
@@ -5914,7 +5914,7 @@
           <w:b w:val="0"/>
           <w:sz w:val="24"/>
         </w:rPr>
-        <w:t>A computer-implemented system and method govern execution of computational actions in artificial-intelligence and agentic systems. Input actions are encoded as six-dimensional context vectors weighted by successive powers of the golden ratio and embedded into a Poincare ball model of hyperbolic space. Hyperbolic distance between the embedded point and a session centroid representing prior authorized behavior drives an exponential authorization cost that makes adversarial deviations computationally prohibitive. Governance decisions -- allow, quarantine, escalate, or deny -- combine the authorization cost with bijective tamper detection, instruction-safety pattern matching, and spectral coherence signals. Denied actions return deterministic pseudorandom noise indistinguishable from valid output. Authorized actions receive post-quantum cryptographic receipts signed under ML-DSA-65 and encapsulated under ML-KEM-768.</w:t>
+        <w:t>A computer-implemented system and method govern execution of computational actions in artificial-intelligence and agentic systems. Input actions are encoded as six-dimensional context vectors weighted by successive powers of the golden ratio and embedded into a Poincare ball model of hyperbolic space. Hyperbolic distance between the embedded point and a session centroid representing prior authorized behavior drives an exponential authorization cost that makes adversarial deviations computationally prohibitive. Governance decisions -- allow, quarantine, escalate, or deny -- combine the authorization cost with bijective tamper detection, instruction-safety pattern matching, and spectral coherence signals. Denied actions return deterministic pseudorandom-looking audit noise instead of a structured failure category. Authorized actions receive post-quantum cryptographic receipts signed under ML-DSA-65 and encapsulated under ML-KEM-768.</w:t>
       </w:r>
     </w:p>
     <w:sectPr>

</xml_diff>

<commit_message>
docs(patent): legal packet review pass — remove overclaim language, regenerate figures
- Remove absolute claims: 'cannot be circumvented', 'guarantee', '100% detection',
  'practically impenetrable', 'indistinguishable' fail-to-noise language
- Cost function family now three alternatives: R^(d^2), 1/(1+d+2pd), pi^(phi*d*)
- Remove legacy claim appendix leaking into detailed description body
- Regenerate FIG 2 (all three cost curves), FIG 5/6/7 (safer output framing)
- Local validation: sections_ok, claims_ok, abstract=117 words, 0 risky phrases
- Add legal_packet_review_2026-05-28.md and math_and_interface_audit

Remaining blockers: ADS address (Patent Center only), DOCX validator upload, fees

Co-Authored-By: Claude Sonnet 4.6 <noreply@anthropic.com>
</commit_message>
<xml_diff>
--- a/docs/legal/SCBE_NONPROVISIONAL_SPEC_v1.docx
+++ b/docs/legal/SCBE_NONPROVISIONAL_SPEC_v1.docx
@@ -123,7 +123,7 @@
           <w:b w:val="0"/>
           <w:sz w:val="24"/>
         </w:rPr>
-        <w:t>Machine learning-based anomaly detection systems have partially addressed this limitation by learning behavioral baselines and flagging statistical outliers. However, such systems suffer from three well-documented weaknesses: (1) adversarial examples can fool learned classifiers through carefully crafted inputs that remain within the learned decision boundary; (2) model drift requires continuous retraining, creating windows of vulnerability; and (3) the security guarantees are probabilistic rather than mathematical, meaning no formal proof of security boundary integrity can be provided.</w:t>
+        <w:t>Machine learning-based anomaly detection systems have partially addressed this limitation by learning behavioral baselines and flagging statistical outliers. However, such systems suffer from three well-documented weaknesses: (1) adversarial examples can fool learned classifiers through carefully crafted inputs that remain within the learned decision boundary; (2) model drift requires continuous retraining, creating windows of vulnerability; and (3) the resulting security posture is typically statistical rather than a deterministic metric boundary computed from the request state.</w:t>
       </w:r>
     </w:p>
     <w:p>
@@ -304,7 +304,7 @@
           <w:b w:val="0"/>
           <w:sz w:val="24"/>
         </w:rPr>
-        <w:t>The present invention provides a computer-implemented system and method for governing execution of computational actions in artificial-intelligence and agentic systems. The system embeds input actions into a Poincare ball model of bounded hyperbolic space, measures hyperbolic distance from a session-adaptive centroid representing prior authorized behavior, and applies a nonlinear governance cost function that makes adversarial deviations computationally prohibitive. A four-tier decision gate routes proposed actions to allow, review, quarantine, or deny outcomes.</w:t>
+        <w:t>The present invention provides a computer-implemented system and method for governing execution of computational actions in artificial-intelligence and agentic systems. The system embeds input actions into a Poincare ball model of bounded hyperbolic space, measures hyperbolic distance from a session-adaptive centroid representing prior authorized behavior, and applies a nonlinear governance cost function that increases governance severity as measured deviation increases. A four-tier decision gate routes proposed actions to allow, review, quarantine, or deny outcomes.</w:t>
       </w:r>
     </w:p>
     <w:p>
@@ -655,7 +655,7 @@
           <w:b w:val="0"/>
           <w:sz w:val="24"/>
         </w:rPr>
-        <w:t>"Hyperbolic Distance": The distance function d_H(u, v) = arcosh(1 + 2||u-v||^2 / ((1-||u||^2)(1-||v||^2))) defined on the Poincare ball, which is the unique distance function satisfying the axioms of hyperbolic geometry in this model. This distance is a mathematical invariant -- it is determined by the metric tensor and cannot be circumvented or approximated by adversarial means.</w:t>
+        <w:t>"Hyperbolic Distance": The distance function d_H(u, v) = arcosh(1 + 2||u-v||^2 / ((1-||u||^2)(1-||v||^2))) defined on the Poincare ball, which is the distance function satisfying the axioms of hyperbolic geometry in this model. This distance is a mathematical invariant determined by the metric tensor and is not changed by the coordinate representation selected for the request.</w:t>
       </w:r>
     </w:p>
     <w:p>
@@ -948,7 +948,7 @@
           <w:b w:val="0"/>
           <w:sz w:val="24"/>
         </w:rPr>
-        <w:t>Each layer implements one or more of twelve mathematical axioms (A1 through A12) that collectively guarantee the system's security properties. These axioms are additionally mapped to five quantum-mechanical axiom families (Unitarity, Locality, Causality, Symmetry, Composition) for formal verification purposes.</w:t>
+        <w:t>Each layer implements one or more of twelve mathematical axioms (A1 through A12) that collectively define the system's intended security invariants. These axioms are additionally mapped to five quantum-mechanical axiom families (Unitarity, Locality, Causality, Symmetry, Composition) for formal verification purposes.</w:t>
       </w:r>
     </w:p>
     <w:p>
@@ -2059,7 +2059,7 @@
           <w:b w:val="0"/>
           <w:sz w:val="24"/>
         </w:rPr>
-        <w:t>The critical property is the transition from manageable cost to impossible cost over a narrow range of d. Between d = 2 and d = 4, the cost increases by a factor of approximately 163,000. This creates a sharp, well-defined security boundary that is continuously differentiable (no threshold artifacts) yet practically impenetrable.</w:t>
+        <w:t>The critical property is the transition from lower cost to substantially higher cost over a narrow range of d. Between d = 2 and d = 4 in the R^(d^2) embodiment, the cost increases by a factor of approximately 163,000. This creates a sharp, well-defined security boundary that is continuously differentiable while still allowing configured runtime thresholds.</w:t>
       </w:r>
     </w:p>
     <w:p>
@@ -2234,7 +2234,7 @@
           <w:b w:val="0"/>
           <w:sz w:val="24"/>
         </w:rPr>
-        <w:t>Corollary (North-Star Enforcement): Any deviation from perfect alignment (d* = 0, T = 1, I = 1) guarantees Risk' &gt; B. There is no "free lunch" -- every deviation carries a cost.</w:t>
+        <w:t>Corollary (North-Star Enforcement): Under the stated risk function, deviation from perfect alignment (d* = 0, T = 1, I = 1) increases Risk' above the baseline B. Thus measured deviation contributes to the governance cost.</w:t>
       </w:r>
     </w:p>
     <w:p>
@@ -2827,7 +2827,7 @@
           <w:b w:val="0"/>
           <w:sz w:val="24"/>
         </w:rPr>
-        <w:t>These properties guarantee that the Langues Metric is a well-behaved, strictly increasing cost function that becomes exponentially more expensive as any deviation increases, with bounded oscillation providing temporal unpredictability.</w:t>
+        <w:t>These properties provide a well-behaved, strictly increasing cost function that becomes more expensive as deviation increases, with bounded oscillation providing temporal variation.</w:t>
       </w:r>
     </w:p>
     <w:p>
@@ -4419,7 +4419,7 @@
         <w:br/>
         <w:t>2. High detection rate for compromised agents: A compromised agent that has been adversarially modified will attempt to compute the impossible result, revealing its corruption.</w:t>
         <w:br/>
-        <w:t>3. No information leakage: The trap challenges are indistinguishable from normal computational requests until the agent attempts to solve them, preventing adversaries from pre-filtering traps.</w:t>
+        <w:t>3. Reduced pre-filtering signal: The trap challenges are formatted as normal computational requests until the agent attempts to solve them, reducing the ability of an adversary to pre-filter traps by surface form alone.</w:t>
       </w:r>
     </w:p>
     <w:p>
@@ -4820,7 +4820,7 @@
           <w:b w:val="0"/>
           <w:sz w:val="24"/>
         </w:rPr>
-        <w:t>Overall: 71% of attacks are blocked (cannot proceed), 29% are detected (proceed but identified). 100% detection rate across all attack types.</w:t>
+        <w:t>In the simulated fixture set, 71% of attacks are blocked (cannot proceed), and 29% are detected (proceed but identified). The fixture set produced detections across all enumerated attack types.</w:t>
       </w:r>
     </w:p>
     <w:p>
@@ -4955,7 +4955,7 @@
           <w:b w:val="0"/>
           <w:sz w:val="24"/>
         </w:rPr>
-        <w:t>Every claim in this patent application is backed by working, tested code demonstrating reduction to practice.</w:t>
+        <w:t>Each drafted claim is mapped to working implementation evidence or is separately flagged for review as a higher-risk or continuation-style feature.</w:t>
       </w:r>
     </w:p>
     <w:p>
@@ -5335,7 +5335,7 @@
           <w:b w:val="0"/>
           <w:sz w:val="24"/>
         </w:rPr>
-        <w:t>whereby the governance cost follows a function of the form B^(k*d), where B is a base greater than one, k is a positive scaling constant, and d is a distance measure computed from the hyperbolic space, such that the governance cost increases monotonically as the embedded point deviates from the session centroid.</w:t>
+        <w:t>whereby the governance cost is a nonlinear increasing function of measured drift from the session centroid and is used to control execution of the computational action through the emitted governance decision.</w:t>
       </w:r>
     </w:p>
     <w:p>
@@ -5825,7 +5825,7 @@
           <w:b w:val="0"/>
           <w:sz w:val="24"/>
         </w:rPr>
-        <w:t>21. The method of claim 1, further comprising generating a cryptographic authorization container that is unlocked only when N predetermined predicates are satisfied, where N is at least three, the predicates including at least: a semantic predicate evaluating whether the context representation of the proposed action satisfies an authorized semantic profile; a geometric predicate measuring whether the embedded point lies within a predetermined hyperbolic distance from the session centroid; and a cryptographic predicate verifying a post-quantum signature; wherein failure of any predicate causes the container to return a noise output generated by the fail-to-noise function of claim 7, such that both a successful unlock and any predicate failure produce outputs that are indistinguishable to an observer not holding the authorization keys.</w:t>
+        <w:t>21. The method of claim 1, further comprising generating a cryptographic authorization container that is unlocked only when N predetermined predicates are satisfied, where N is at least three, the predicates including at least: a semantic predicate evaluating whether the context representation of the proposed action satisfies an authorized semantic profile; a geometric predicate measuring whether the embedded point lies within a predetermined hyperbolic distance from the session centroid; and a cryptographic predicate verifying a post-quantum signature; wherein failure of any predicate causes the container to return a noise or pseudorandom-looking output generated by the fail-to-noise function of claim 7 rather than a structured predicate-failure response.</w:t>
       </w:r>
     </w:p>
     <w:p>
@@ -5839,7 +5839,7 @@
           <w:b w:val="0"/>
           <w:sz w:val="24"/>
         </w:rPr>
-        <w:t>22. The method of claim 21, wherein the noise output is generated by the deterministic re-hashing of claim 7, such that every output path -- both a successful unlock and a failure of any predicate -- produces an output indistinguishable, to an observer not holding the keys for all of the predicates, from any other output path.</w:t>
+        <w:t>22. The method of claim 21, wherein the noise output is generated by the deterministic re-hashing of claim 7, such that a repeated failure path for the same denied request produces an audit-reproducible output of a predetermined length while avoiding disclosure of which predicate failed.</w:t>
       </w:r>
     </w:p>
     <w:p>
@@ -5914,7 +5914,7 @@
           <w:b w:val="0"/>
           <w:sz w:val="24"/>
         </w:rPr>
-        <w:t>A computer-implemented system and method govern execution of computational actions in artificial-intelligence and agentic systems. Input actions are encoded as six-dimensional context vectors weighted by successive powers of the golden ratio and embedded into a Poincare ball model of hyperbolic space. Hyperbolic distance between the embedded point and a session centroid representing prior authorized behavior drives an exponential authorization cost that makes adversarial deviations computationally prohibitive. Governance decisions -- allow, quarantine, escalate, or deny -- combine the authorization cost with bijective tamper detection, instruction-safety pattern matching, and spectral coherence signals. Denied actions return deterministic pseudorandom-looking audit noise instead of a structured failure category. Authorized actions receive post-quantum cryptographic receipts signed under ML-DSA-65 and encapsulated under ML-KEM-768.</w:t>
+        <w:t>A computer-implemented system and method govern execution of computational actions in artificial-intelligence and agentic systems. Input actions are encoded as six-dimensional context vectors weighted by successive powers of the golden ratio and embedded into a Poincare ball model of hyperbolic space. Hyperbolic distance between the embedded point and a session centroid representing prior authorized behavior drives a nonlinear authorization cost or safety score used to control execution. Governance decisions -- allow, review, quarantine, or deny -- combine the authorization cost with bijective tamper detection, instruction-safety pattern matching, and spectral coherence signals. Denied actions return deterministic pseudorandom-looking audit noise instead of a structured failure category. Authorized actions receive post-quantum cryptographic receipts signed under ML-DSA-65 and encapsulated under ML-KEM-768.</w:t>
       </w:r>
     </w:p>
     <w:sectPr>

</xml_diff>

<commit_message>
docs(patent): add claim 26 — bijective token alphabet per tongue axis
Covers Sacred Tongues 16x16 prefix-suffix grid design. Closes gap where a
competitor could implement phi-weighting (claim 4) with a non-bijective or
merged-vocabulary tokenizer without infringing. Dependent on claim 4.

Fee update: 26 claims, $640 micro-entity ($400 base + 6 extra x $40).
Updated: build_patent_docx.py, PATENT_CLAIMS_FIXED_v3.md, assembled MD,
SCBE_NONPROVISIONAL_SPEC_v1.docx (rebuilt), checklist.

Co-Authored-By: Claude Sonnet 4.6 <noreply@anthropic.com>
</commit_message>
<xml_diff>
--- a/docs/legal/SCBE_NONPROVISIONAL_SPEC_v1.docx
+++ b/docs/legal/SCBE_NONPROVISIONAL_SPEC_v1.docx
@@ -5882,6 +5882,20 @@
           <w:sz w:val="24"/>
         </w:rPr>
         <w:t>25. The system of claim 9, wherein the system coordinates task execution across a plurality of agent slots using a physics-based juggling model in which tasks are modeled as balls having inertia proportional to a task priority, agent slots are modeled as hands having readiness states, handoffs are modeled as throws having predicted catch windows, and a governance cost of a task increases when a trajectory of the task deviates from a predicted flight arc, such that higher-risk tasks are assigned higher arcs and fewer handoffs.</w:t>
+      </w:r>
+    </w:p>
+    <w:p>
+      <w:pPr>
+        <w:spacing w:before="120" w:after="120" w:line="360" w:lineRule="exact"/>
+        <w:ind w:left="0" w:firstLine="0"/>
+      </w:pPr>
+      <w:r>
+        <w:rPr>
+          <w:rFonts w:ascii="Times New Roman" w:hAnsi="Times New Roman"/>
+          <w:b w:val="0"/>
+          <w:sz w:val="24"/>
+        </w:rPr>
+        <w:t>26. The method of claim 4, wherein each axis of the six-axis semantic weighting employs a bijective token alphabet in which each token is uniquely identified by a prefix element selected from a first predetermined set and a suffix element selected from a second predetermined set, such that the complete token vocabulary for each axis is a bijective mapping between token strings and integer indices, and the token vocabularies of distinct axes are disjoint.</w:t>
       </w:r>
     </w:p>
     <w:p>

</xml_diff>